<commit_message>
Accessibility/UX polish pass + prose tightening
- Add global :focus-visible ring (keyboard nav had no visible focus indicator anywhere)
- Fix modal close buttons: 44x44 touch target (was ~22x22) + aria-label
- Add aria-label to shortlist remove button
- Add prefers-reduced-motion support
- Tighten README.md and Setup Guide prose (remove em-dashes/AI writing tells)
</commit_message>
<xml_diff>
--- a/docs/FMCC Setup Guide.docx
+++ b/docs/FMCC Setup Guide.docx
@@ -41,7 +41,7 @@
           <w:sz w:val="21"/>
           <w:szCs w:val="21"/>
         </w:rPr>
-        <w:t xml:space="preserve">This is the checklist for populating FM Command Centre from a brand new Football Manager 26 save — whether that's you starting a fresh career or a friend setting the app up for the first time. It covers exactly what to capture from FM, in what order, and how to hand it over so the app gets filled in without touching a line of code.</w:t>
+        <w:t xml:space="preserve">This is the checklist for populating FM Command Centre from a brand new Football Manager 26 save, whether that's you starting a fresh career or a friend setting the app up for the first time. It covers exactly what to capture from FM, in what order, and how to hand it over so the app gets filled in without touching a line of code.</w:t>
       </w:r>
     </w:p>
     <w:p>
@@ -81,7 +81,7 @@
           <w:sz w:val="21"/>
           <w:szCs w:val="21"/>
         </w:rPr>
-        <w:t xml:space="preserve">Football Manager 26 masks attribute values by default — screens show star ratings instead of the real numbers, which are slow and easy to misread at a glance (small half-star icons in particular). This setting can only be changed when the save is created, not afterwards, so it's worth doing first.</w:t>
+        <w:t xml:space="preserve">Football Manager 26 masks attribute values by default. Screens show star ratings instead of the real numbers, which are slow and easy to misread at a glance (small half-star icons in particular). This setting can only be changed when the save is created, not afterwards, so it's worth doing first.</w:t>
       </w:r>
     </w:p>
     <w:p>
@@ -132,7 +132,7 @@
           <w:sz w:val="21"/>
           <w:szCs w:val="21"/>
         </w:rPr>
-        <w:t xml:space="preserve">Every attribute screen and squad view will now show plain numbers (1–20) instead of stars — much faster and more accurate to transcribe, and this is what the Squad Attributes step in Section 4 depends on.</w:t>
+        <w:t xml:space="preserve">Every attribute screen and squad view will now show plain numbers (1–20) instead of stars: much faster and more accurate to transcribe, and this is what the Squad Attributes step in Section 4 depends on.</w:t>
       </w:r>
     </w:p>
     <w:p>
@@ -147,7 +147,7 @@
           <w:sz w:val="19"/>
           <w:szCs w:val="19"/>
         </w:rPr>
-        <w:t xml:space="preserve">If you're mid-save already and masking is still on, the capture steps below still work — they'll just take a bit more care reading star ratings, same as this app's own Metalul Buzău data did originally.</w:t>
+        <w:t xml:space="preserve">If you're mid-save already and masking is still on, the capture steps below still work. They'll just take a bit more care reading star ratings, same as this app's own Metalul Buzău data did originally.</w:t>
       </w:r>
     </w:p>
     <w:p>
@@ -175,7 +175,7 @@
           <w:sz w:val="21"/>
           <w:szCs w:val="21"/>
         </w:rPr>
-        <w:t xml:space="preserve">These are all single-screen captures — a screenshot of each is enough for Claude to read directly. Take them once, near the start of a session, so the season numbers are all from the same point in time.</w:t>
+        <w:t xml:space="preserve">These are all single-screen captures: a screenshot of each is enough for Claude to read directly. Take them once, near the start of a session, so the season numbers are all from the same point in time.</w:t>
       </w:r>
     </w:p>
     <w:tbl>
@@ -290,7 +290,7 @@
                 <w:sz w:val="19"/>
                 <w:szCs w:val="19"/>
               </w:rPr>
-              <w:t xml:space="preserve">Year founded — and, with "Show Unique IDs" on (Section 6), the Club ID shown right next to the club name. That ID goes in club.fmClubId (Section 8) and auto-loads the crest/kit images from a connected FM graphics folder.</w:t>
+              <w:t xml:space="preserve">Year founded, and, with "Show Unique IDs" on (Section 6), the Club ID shown right next to the club name. That ID goes in club.fmClubId (Section 8) and auto-loads the crest/kit images from a connected FM graphics folder.</w:t>
             </w:r>
           </w:p>
         </w:tc>
@@ -411,7 +411,7 @@
                 <w:sz w:val="19"/>
                 <w:szCs w:val="19"/>
               </w:rPr>
-              <w:t xml:space="preserve">Portal › Stages › Competition Overview (one level up from the League Table above — click the competition name/breadcrumb)</w:t>
+              <w:t xml:space="preserve">Portal › Stages › Competition Overview (one level up from the League Table above, click the competition name/breadcrumb)</w:t>
             </w:r>
           </w:p>
         </w:tc>
@@ -434,7 +434,7 @@
                 <w:sz w:val="19"/>
                 <w:szCs w:val="19"/>
               </w:rPr>
-              <w:t xml:space="preserve">Optional — only needed for the league logo. With "Show Unique IDs" on (Section 6), the League/Competition ID shown next to the competition name. Goes in club.fmCompetitionId (Section 8).</w:t>
+              <w:t xml:space="preserve">Optional: only needed for the league logo. With "Show Unique IDs" on (Section 6), the League/Competition ID shown next to the competition name. Goes in club.fmCompetitionId (Section 8).</w:t>
             </w:r>
           </w:p>
         </w:tc>
@@ -530,7 +530,7 @@
                 <w:sz w:val="19"/>
                 <w:szCs w:val="19"/>
               </w:rPr>
-              <w:t xml:space="preserve">Honours won during your tenure — league titles, cups, etc., with the years</w:t>
+              <w:t xml:space="preserve">Honours won during your tenure: league titles, cups, etc., with the years</w:t>
             </w:r>
           </w:p>
         </w:tc>
@@ -578,7 +578,7 @@
                 <w:sz w:val="19"/>
                 <w:szCs w:val="19"/>
               </w:rPr>
-              <w:t xml:space="preserve">Cups + League Wins (for "Trophies Won"), Win Percentage, and — under Player Stats — career Transfers Spent and Players Signed</w:t>
+              <w:t xml:space="preserve">Cups + League Wins (for "Trophies Won"), Win Percentage, and (under Player Stats) career Transfers Spent and Players Signed</w:t>
             </w:r>
           </w:p>
         </w:tc>
@@ -598,7 +598,7 @@
           <w:sz w:val="21"/>
           <w:szCs w:val="21"/>
         </w:rPr>
-        <w:t xml:space="preserve">Also note the in-game date you captured this on — it becomes the "Save data — [date]" label in the app's hotbar, and is a useful reminder of how stale the snapshot is next time you look at the app.</w:t>
+        <w:t xml:space="preserve">Also note the in-game date you captured this on. It becomes the "Save data — [date]" label in the app's hotbar, and is a useful reminder of how stale the snapshot is next time you look at the app.</w:t>
       </w:r>
     </w:p>
     <w:p>
@@ -610,7 +610,7 @@
           <w:sz w:val="21"/>
           <w:szCs w:val="21"/>
         </w:rPr>
-        <w:t xml:space="preserve">Also grab the FM save file's own name — whatever you (or a friend) named it when saving, visible on FM's Continue/load-game screen or in your saves folder. It drives the small subtitle under "FM Command Centre" in the app's hotbar (club.saveFileName in Section 8), kept separate from the club name shown everywhere else in the app. No screenshot needed for this one — you already know it, just type it straight into the JSON.</w:t>
+        <w:t xml:space="preserve">Also grab the FM save file's own name, whatever you (or a friend) named it when saving, visible on FM's Continue/load-game screen or in your saves folder. It drives the small subtitle under "FM Command Centre" in the app's hotbar (club.saveFileName in Section 8), kept separate from the club name shown everywhere else in the app. No screenshot needed for this one. You already know it, just type it straight into the JSON.</w:t>
       </w:r>
     </w:p>
     <w:p>
@@ -622,7 +622,7 @@
           <w:sz w:val="21"/>
           <w:szCs w:val="21"/>
         </w:rPr>
-        <w:t xml:space="preserve">Optionally, also screenshot the full League Table (Portal › Stages › League Table (Overall), scrolled to show every club, not just your own row) — this powers the League Table popup you get by clicking the season-stats pill on the Save Overview tile (leagueTable in Section 8). Skip this if you don't want the popup; the pill itself only ever needed your own row above.</w:t>
+        <w:t xml:space="preserve">Optionally, also screenshot the full League Table (Portal › Stages › League Table (Overall), scrolled to show every club, not just your own row). This powers the League Table popup you get by clicking the season-stats pill on the Save Overview tile (leagueTable in Section 8). Skip this if you don't want the popup; the pill itself only ever needed your own row above.</w:t>
       </w:r>
     </w:p>
     <w:p>
@@ -650,7 +650,7 @@
           <w:sz w:val="21"/>
           <w:szCs w:val="21"/>
         </w:rPr>
-        <w:t xml:space="preserve">A single Squad › First Team screenshot (or a couple if it needs scrolling) covering the columns below is enough. If General Info doesn't show all of these, duplicate that view and add the missing columns — Best Position/Role, Appearances, Goals, Assists and Wage in particular are often not shown by default.</w:t>
+        <w:t xml:space="preserve">A single Squad › First Team screenshot (or a couple if it needs scrolling) covering the columns below is enough. If General Info doesn't show all of these, duplicate that view and add the missing columns: Best Position/Role, Appearances, Goals, Assists and Wage in particular are often not shown by default.</w:t>
       </w:r>
     </w:p>
     <w:tbl>
@@ -813,7 +813,7 @@
                 <w:sz w:val="19"/>
                 <w:szCs w:val="19"/>
               </w:rPr>
-              <w:t xml:space="preserve">Star ratings are fine here — these two aren't affected by attribute masking</w:t>
+              <w:t xml:space="preserve">Star ratings are fine here: these two aren't affected by attribute masking</w:t>
             </w:r>
           </w:p>
         </w:tc>
@@ -1005,7 +1005,7 @@
                 <w:sz w:val="19"/>
                 <w:szCs w:val="19"/>
               </w:rPr>
-              <w:t xml:space="preserve">Note anyone injured, or out/in on loan — go by the player’s NAME COLOUR in the squad list (a highlighted/red name means they’re actually out or in on loan), not the Inf column tag next to their name — tags like “Loa” can just mean loan-listed while the player is still with the squad. Not a column, just a mental note per player.</w:t>
+              <w:t xml:space="preserve">Note anyone injured, or out/in on loan: go by the player’s NAME COLOUR in the squad list (a highlighted/red name means they’re actually out or in on loan), not the Inf column tag next to their name. Tags like “Loa” can just mean loan-listed while the player is still with the squad. Not a column, just a mental note per player.</w:t>
             </w:r>
           </w:p>
         </w:tc>
@@ -1024,7 +1024,7 @@
           <w:sz w:val="30"/>
           <w:szCs w:val="30"/>
         </w:rPr>
-        <w:t xml:space="preserve">4. Squad Attributes — the Fast Way</w:t>
+        <w:t xml:space="preserve">4. Squad Attributes: the Fast Way</w:t>
       </w:r>
     </w:p>
     <w:p>
@@ -1036,7 +1036,7 @@
           <w:sz w:val="21"/>
           <w:szCs w:val="21"/>
         </w:rPr>
-        <w:t xml:space="preserve">Don't open 25–30 individual player profiles. FM26's Squad screen has built-in column-view presets that show every player's full attribute set on one scrollable table — six screenshots (seven if you're capturing goalkeepers separately) covers the whole squad.</w:t>
+        <w:t xml:space="preserve">Don't open 25–30 individual player profiles. FM26's Squad screen has built-in column-view presets that show every player's full attribute set on one scrollable table: six screenshots (seven if you're capturing goalkeepers separately) covers the whole squad.</w:t>
       </w:r>
     </w:p>
     <w:p>
@@ -1070,7 +1070,7 @@
           <w:sz w:val="21"/>
           <w:szCs w:val="21"/>
         </w:rPr>
-        <w:t xml:space="preserve">Switch the column view preset to "Technical" — screenshot the full list (scroll and re-screenshot if the squad doesn't fit on one screen).</w:t>
+        <w:t xml:space="preserve">Switch the column view preset to "Technical", then screenshot the full list (scroll and re-screenshot if the squad doesn't fit on one screen).</w:t>
       </w:r>
     </w:p>
     <w:p>
@@ -1087,7 +1087,7 @@
           <w:sz w:val="21"/>
           <w:szCs w:val="21"/>
         </w:rPr>
-        <w:t xml:space="preserve">Switch to "Attacking" — screenshot it too. FM26's Technical preset runs out of columns before reaching Dribbling, so this is where that one comes from.</w:t>
+        <w:t xml:space="preserve">Switch to "Attacking", then screenshot it too. FM26's Technical preset runs out of columns before reaching Dribbling, so this is where that one comes from.</w:t>
       </w:r>
     </w:p>
     <w:p>
@@ -1104,7 +1104,7 @@
           <w:sz w:val="21"/>
           <w:szCs w:val="21"/>
         </w:rPr>
-        <w:t xml:space="preserve">Switch to "Defensive" — screenshot it too. FM26's Technical preset doesn't include Marking, so this is where that one column comes from.</w:t>
+        <w:t xml:space="preserve">Switch to "Defensive", then screenshot it too. FM26's Technical preset doesn't include Marking, so this is where that one column comes from.</w:t>
       </w:r>
     </w:p>
     <w:p>
@@ -1121,7 +1121,7 @@
           <w:sz w:val="21"/>
           <w:szCs w:val="21"/>
         </w:rPr>
-        <w:t xml:space="preserve">Switch to "Mental" — screenshot.</w:t>
+        <w:t xml:space="preserve">Switch to "Mental", then screenshot.</w:t>
       </w:r>
     </w:p>
     <w:p>
@@ -1138,7 +1138,7 @@
           <w:sz w:val="21"/>
           <w:szCs w:val="21"/>
         </w:rPr>
-        <w:t xml:space="preserve">Switch to "Physical" — screenshot.</w:t>
+        <w:t xml:space="preserve">Switch to "Physical", then screenshot.</w:t>
       </w:r>
     </w:p>
     <w:p>
@@ -1155,7 +1155,7 @@
           <w:sz w:val="21"/>
           <w:szCs w:val="21"/>
         </w:rPr>
-        <w:t xml:space="preserve">Switch to "Goalkeeping" — screenshot (only your goalkeepers need this one; outfield players don't have goalkeeping attributes).</w:t>
+        <w:t xml:space="preserve">Switch to "Goalkeeping", then screenshot (only your goalkeepers need this one; outfield players don't have goalkeeping attributes).</w:t>
       </w:r>
     </w:p>
     <w:p>
@@ -1170,7 +1170,7 @@
           <w:sz w:val="19"/>
           <w:szCs w:val="19"/>
         </w:rPr>
-        <w:t xml:space="preserve">With masking off (Section 1) these screenshots show real numbers, so Claude can transcribe them directly and accurately — no star-counting, no correction pass needed afterwards.</w:t>
+        <w:t xml:space="preserve">With masking off (Section 1) these screenshots show real numbers, so Claude can transcribe them directly and accurately: no star-counting, no correction pass needed afterwards.</w:t>
       </w:r>
     </w:p>
     <w:p>
@@ -1198,7 +1198,7 @@
           <w:sz w:val="21"/>
           <w:szCs w:val="21"/>
         </w:rPr>
-        <w:t xml:space="preserve">The app's Tactic Builder can construct a tactic for you from scratch using the imported squad, so this section is optional — skip it if you'd rather build tactics inside the app instead of re-capturing your exact in-game setup.</w:t>
+        <w:t xml:space="preserve">The app's Tactic Builder can construct a tactic for you from scratch using the imported squad, so this section is optional. Skip it if you'd rather build tactics inside the app instead of re-capturing your exact in-game setup.</w:t>
       </w:r>
     </w:p>
     <w:p>
@@ -1232,7 +1232,7 @@
           <w:sz w:val="21"/>
           <w:szCs w:val="21"/>
         </w:rPr>
-        <w:t xml:space="preserve">For each position, you only need its role name and roughly where it sits on the pitch — that's all the app actually reads. It doesn't need the player assigned there, FM's own role-suitability rating, or any per-player attributes for this step.</w:t>
+        <w:t xml:space="preserve">For each position, you only need its role name and roughly where it sits on the pitch. That's all the app actually reads. It doesn't need the player assigned there, FM's own role-suitability rating, or any per-player attributes for this step.</w:t>
       </w:r>
     </w:p>
     <w:p>
@@ -1249,7 +1249,7 @@
           <w:sz w:val="21"/>
           <w:szCs w:val="21"/>
         </w:rPr>
-        <w:t xml:space="preserve">Player assignment and fit are computed live from the full squad data captured in Section 4 instead — the app's own "Recommended Player" already re-checks every eligible squad member's real attributes against the role, which stays accurate as your squad changes and doesn't rely on FM's own (opaque) suitability stars.</w:t>
+        <w:t xml:space="preserve">Player assignment and fit are computed live from the full squad data captured in Section 4 instead. The app's own "Recommended Player" already re-checks every eligible squad member's real attributes against the role, which stays accurate as your squad changes and doesn't rely on FM's own (opaque) suitability stars.</w:t>
       </w:r>
     </w:p>
     <w:p>
@@ -1294,7 +1294,7 @@
           <w:sz w:val="21"/>
           <w:szCs w:val="21"/>
         </w:rPr>
-        <w:t xml:space="preserve">The crest itself doesn't need to go through the JSON import — Settings › Club &amp; Branding already has a click-to-upload option (click the crest on the dashboard), plus an FM graphics-folder auto-lookup for a club crest, a league/competition logo, and kit images (home/away/third), all already in the app.</w:t>
+        <w:t xml:space="preserve">The crest itself doesn't need to go through the JSON import: Settings › Club &amp; Branding already has a click-to-upload option (click the crest on the dashboard), plus an FM graphics-folder auto-lookup for a club crest, a league/competition logo, and kit images (home/away/third), all already in the app.</w:t>
       </w:r>
     </w:p>
     <w:p>
@@ -1306,7 +1306,7 @@
           <w:sz w:val="21"/>
           <w:szCs w:val="21"/>
         </w:rPr>
-        <w:t xml:space="preserve">Those lookups all work by numeric ID, though, and Football Manager doesn't show those IDs anywhere by default. The good news: once you turn the setting on, the IDs show up right in two screenshots you’re already capturing in Section 2 — so Claude can read them straight off those and drop them into the JSON as club.fmClubId / club.fmCompetitionId (Section 8), with nothing to note down or type in by hand.</w:t>
+        <w:t xml:space="preserve">Those lookups all work by numeric ID, though, and Football Manager doesn't show those IDs anywhere by default. The good news: once you turn the setting on, the IDs show up right in two screenshots you’re already capturing in Section 2, so Claude can read them straight off those and drop them into the JSON as club.fmClubId / club.fmCompetitionId (Section 8), with nothing to note down or type in by hand.</w:t>
       </w:r>
     </w:p>
     <w:p>
@@ -1340,7 +1340,7 @@
           <w:sz w:val="21"/>
           <w:szCs w:val="21"/>
         </w:rPr>
-        <w:t xml:space="preserve">With that on, the Club Site screenshot you already capture in Section 2 will show the Club ID right next to the club name — nothing extra to photograph. This same ID covers kit images too.</w:t>
+        <w:t xml:space="preserve">With that on, the Club Site screenshot you already capture in Section 2 will show the Club ID right next to the club name. Nothing extra to photograph. This same ID covers kit images too.</w:t>
       </w:r>
     </w:p>
     <w:p>
@@ -1357,7 +1357,7 @@
           <w:sz w:val="21"/>
           <w:szCs w:val="21"/>
         </w:rPr>
-        <w:t xml:space="preserve">For the league logo, also capture the Competition Overview screenshot noted in Section 2 (Portal › Stages › Competition Overview) — its Unique ID shows next to the competition name the same way.</w:t>
+        <w:t xml:space="preserve">For the league logo, also capture the Competition Overview screenshot noted in Section 2 (Portal › Stages › Competition Overview); its Unique ID shows next to the competition name the same way.</w:t>
       </w:r>
     </w:p>
     <w:p>
@@ -1369,7 +1369,7 @@
           <w:sz w:val="21"/>
           <w:szCs w:val="21"/>
         </w:rPr>
-        <w:t xml:space="preserve">Hand both screenshots to Claude along with the rest (Section 7) and ask it to include club.fmClubId / club.fmCompetitionId in the JSON (Section 8) — the app then auto-loads the crest, kit images, and league logo the moment an FM graphics folder is connected, with nothing to type into Settings by hand. If you'd rather skip Claude for this part, the Club &amp; League Graphics panel in Settings still accepts both IDs typed in directly.</w:t>
+        <w:t xml:space="preserve">Hand both screenshots to Claude along with the rest (Section 7) and ask it to include club.fmClubId / club.fmCompetitionId in the JSON (Section 8). The app then auto-loads the crest, kit images, and league logo the moment an FM graphics folder is connected, with nothing to type into Settings by hand. If you'd rather skip Claude for this part, the Club &amp; League Graphics panel in Settings still accepts both IDs typed in directly.</w:t>
       </w:r>
     </w:p>
     <w:p>
@@ -1381,7 +1381,7 @@
           <w:sz w:val="21"/>
           <w:szCs w:val="21"/>
         </w:rPr>
-        <w:t xml:space="preserve">The two club colours (used to theme the whole app) do need to go in the JSON, as hex codes. Take a screenshot of the club crest and ask Claude to pick out the primary and secondary colours as hex values — or use any colour-picker tool you already have.</w:t>
+        <w:t xml:space="preserve">The two club colours (used to theme the whole app) do need to go in the JSON, as hex codes. Take a screenshot of the club crest and ask Claude to pick out the primary and secondary colours as hex values, or use any colour-picker tool you already have.</w:t>
       </w:r>
     </w:p>
     <w:p>
@@ -1421,7 +1421,7 @@
           <w:sz w:val="21"/>
           <w:szCs w:val="21"/>
         </w:rPr>
-        <w:t xml:space="preserve">You don’t need to rename or carefully order the files first — FM’s own on-screen column headers and screen titles usually make it clear what each screenshot is, so Claude can match them up from their content alone. It still helps, for free, to attach them roughly in the order the sections above go (club/season shots, then the squad list, then Technical → Defensive → Mental → Physical → Goalkeeping), and to keep any multi-screenshot section’s images — like a squad list that needed scrolling — next to each other. If anything’s ambiguous, Claude will ask rather than guess.</w:t>
+        <w:t xml:space="preserve">You don’t need to rename or carefully order the files first. FM’s own on-screen column headers and screen titles usually make it clear what each screenshot is, so Claude can match them up from their content alone. It still helps, for free, to attach them roughly in the order the sections above go (club/season shots, then the squad list, then Technical → Defensive → Mental → Physical → Goalkeeping), and to keep any multi-screenshot section’s images (like a squad list that needed scrolling) next to each other. If anything’s ambiguous, Claude will ask rather than guess.</w:t>
       </w:r>
     </w:p>
     <w:p>
@@ -1491,7 +1491,7 @@
           <w:sz w:val="18"/>
           <w:szCs w:val="18"/>
         </w:rPr>
-        <w:t xml:space="preserve">'New Save Data Collection Guide' (Section 8), filled in entirely — I'll paste it</w:t>
+        <w:t xml:space="preserve">'New Save Data Collection Guide' (Section 8), filled in entirely; I'll paste it</w:t>
       </w:r>
     </w:p>
     <w:p>
@@ -1517,7 +1517,7 @@
           <w:sz w:val="21"/>
           <w:szCs w:val="21"/>
         </w:rPr>
-        <w:t xml:space="preserve">Attach this guide itself alongside the screenshots so Claude has the schema on hand — it saves a round trip. The save file's own name (see the note in Section 2) is the one field that can't come from a screenshot, so just swap it into the prompt above — everything else gets filled in from what you attach, with nothing left for you to edit by hand before pasting it into the wizard.</w:t>
+        <w:t xml:space="preserve">Attach this guide itself alongside the screenshots so Claude has the schema on hand: it saves a round trip. The save file's own name (see the note in Section 2) is the one field that can't come from a screenshot, so just swap it into the prompt above. Everything else gets filled in from what you attach, with nothing left for you to edit by hand before pasting it into the wizard.</w:t>
       </w:r>
     </w:p>
     <w:p>
@@ -1545,7 +1545,7 @@
           <w:sz w:val="21"/>
           <w:szCs w:val="21"/>
         </w:rPr>
-        <w:t xml:space="preserve">This is the exact shape the Setup Wizard (Settings → New Save Setup) expects. Every top-level key is optional except club.name and squad — the wizard has a "Load Example Template" button that fills its textbox with a working two-player example matching this shape.</w:t>
+        <w:t xml:space="preserve">This is the exact shape the Setup Wizard (Settings → New Save Setup) expects. Every top-level key is optional except club.name and squad; the wizard has a "Load Example Template" button that fills its textbox with a working two-player example matching this shape.</w:t>
       </w:r>
     </w:p>
     <w:p>
@@ -1783,7 +1783,7 @@
           <w:sz w:val="18"/>
           <w:szCs w:val="18"/>
         </w:rPr>
-        <w:t xml:space="preserve">    // Optional — from the Club Site / Competition Overview screenshots (Section 2)</w:t>
+        <w:t xml:space="preserve">    // Optional: from the Club Site / Competition Overview screenshots (Section 2)</w:t>
       </w:r>
     </w:p>
     <w:p>
@@ -1811,7 +1811,7 @@
           <w:sz w:val="18"/>
           <w:szCs w:val="18"/>
         </w:rPr>
-        <w:t xml:space="preserve">    // and league logo from a connected FM graphics folder — no typing into Settings.</w:t>
+        <w:t xml:space="preserve">    // and league logo from a connected FM graphics folder, no typing into Settings.</w:t>
       </w:r>
     </w:p>
     <w:p>
@@ -1895,7 +1895,7 @@
           <w:sz w:val="18"/>
           <w:szCs w:val="18"/>
         </w:rPr>
-        <w:t xml:space="preserve">  // Optional — every club in the league table, not just yours. Powers the</w:t>
+        <w:t xml:space="preserve">  // Optional: every club in the league table, not just yours. Powers the</w:t>
       </w:r>
     </w:p>
     <w:p>
@@ -2413,7 +2413,7 @@
           <w:sz w:val="18"/>
           <w:szCs w:val="18"/>
         </w:rPr>
-        <w:t xml:space="preserve">        // Goalkeeping (11) — omit this key entirely for outfield players.</w:t>
+        <w:t xml:space="preserve">        // Goalkeeping (11): omit this key entirely for outfield players.</w:t>
       </w:r>
     </w:p>
     <w:p>
@@ -2525,21 +2525,21 @@
           <w:sz w:val="18"/>
           <w:szCs w:val="18"/>
         </w:rPr>
-        <w:t xml:space="preserve">  "tacticIP": [        // optional — omit both to rely on Tactic Builder instead.</w:t>
-      </w:r>
-    </w:p>
-    <w:p>
-      <w:pPr>
-        <w:shd w:fill="F3F3F3" w:val="clear"/>
-        <w:spacing w:after="0" w:line="260"/>
-      </w:pPr>
-      <w:r>
-        <w:rPr>
-          <w:rFonts w:ascii="Consolas" w:cs="Consolas" w:eastAsia="Consolas" w:hAnsi="Consolas"/>
-          <w:sz w:val="18"/>
-          <w:szCs w:val="18"/>
-        </w:rPr>
-        <w:t xml:space="preserve">    // Only position/role/pitchPos are ever read — no player, attributes or</w:t>
+        <w:t xml:space="preserve">  "tacticIP": [        // optional: omit both to rely on Tactic Builder instead.</w:t>
+      </w:r>
+    </w:p>
+    <w:p>
+      <w:pPr>
+        <w:shd w:fill="F3F3F3" w:val="clear"/>
+        <w:spacing w:after="0" w:line="260"/>
+      </w:pPr>
+      <w:r>
+        <w:rPr>
+          <w:rFonts w:ascii="Consolas" w:cs="Consolas" w:eastAsia="Consolas" w:hAnsi="Consolas"/>
+          <w:sz w:val="18"/>
+          <w:szCs w:val="18"/>
+        </w:rPr>
+        <w:t xml:space="preserve">    // Only position/role/pitchPos are ever read: no player, attributes or</w:t>
       </w:r>
     </w:p>
     <w:p>
@@ -2567,7 +2567,7 @@
           <w:sz w:val="18"/>
           <w:szCs w:val="18"/>
         </w:rPr>
-        <w:t xml:space="preserve">    // attacking end — read straight off the Tactics Planner screenshot.</w:t>
+        <w:t xml:space="preserve">    // attacking end, read straight off the Tactics Planner screenshot.</w:t>
       </w:r>
     </w:p>
     <w:p>
@@ -2666,7 +2666,7 @@
           <w:sz w:val="19"/>
           <w:szCs w:val="19"/>
         </w:rPr>
-        <w:t xml:space="preserve">Attribute arrays must be exactly the stated length (14 / 14 / 8 / 11) and in the exact order listed — the Setup Wizard's Validate button checks this and will point out any mismatches before you import.</w:t>
+        <w:t xml:space="preserve">Attribute arrays must be exactly the stated length (14 / 14 / 8 / 11) and in the exact order listed; the Setup Wizard's Validate button checks this and will point out any mismatches before you import.</w:t>
       </w:r>
     </w:p>
     <w:p>
@@ -2733,7 +2733,7 @@
           <w:sz w:val="21"/>
           <w:szCs w:val="21"/>
         </w:rPr>
-        <w:t xml:space="preserve">Click "Validate" — it'll list any shape problems (missing fields, wrong-length attribute arrays) without changing anything yet.</w:t>
+        <w:t xml:space="preserve">Click "Validate" and it'll list any shape problems (missing fields, wrong-length attribute arrays) without changing anything yet.</w:t>
       </w:r>
     </w:p>
     <w:p>
@@ -2750,7 +2750,7 @@
           <w:sz w:val="21"/>
           <w:szCs w:val="21"/>
         </w:rPr>
-        <w:t xml:space="preserve">Once it looks good, click "Import &amp; Reload" — the app reloads with your new save's data in every tile: dashboard, squad, tactics.</w:t>
+        <w:t xml:space="preserve">Once it looks good, click "Import &amp; Reload" and the app reloads with your new save's data in every tile: dashboard, squad, tactics.</w:t>
       </w:r>
     </w:p>
     <w:p>
@@ -2779,7 +2779,7 @@
           <w:sz w:val="21"/>
           <w:szCs w:val="21"/>
         </w:rPr>
-        <w:t xml:space="preserve">That's the whole loop — capture, hand to Claude, paste, import. No source file editing required.</w:t>
+        <w:t xml:space="preserve">That's the whole loop: capture, hand to Claude, paste, import. No source file editing required.</w:t>
       </w:r>
     </w:p>
     <w:sectPr>

</xml_diff>

<commit_message>
Note the capture_club_data.py tool in README and Setup Guide
</commit_message>
<xml_diff>
--- a/docs/FMCC Setup Guide.docx
+++ b/docs/FMCC Setup Guide.docx
@@ -143,6 +143,16 @@
           <w:sz w:val="21"/>
         </w:rPr>
         <w:t>Also note (typed, not screenshotted): the in-game date you captured this on, and the FM save file's own name from the Continue/load-game screen.</w:t>
+      </w:r>
+    </w:p>
+    <w:p>
+      <w:r>
+        <w:rPr>
+          <w:b w:val="0"/>
+          <w:i w:val="0"/>
+          <w:sz w:val="21"/>
+        </w:rPr>
+        <w:t xml:space="preserve">Optional: a script that captures the five screenshots above for you lives at tools/capture_club_data.py in the FMCC project on GitHub (github.com/tomjenk1543/fmcc). It only comes with the full project, not a standalone copy of just the app’s HTML file, so you’ll need to download or clone the whole repo to use it. See tools/README.md there for setup.</w:t>
       </w:r>
     </w:p>
     <w:p>

</xml_diff>

<commit_message>
Capture save name live from FM Menu instead of typing it manually
</commit_message>
<xml_diff>
--- a/docs/FMCC Setup Guide.docx
+++ b/docs/FMCC Setup Guide.docx
@@ -142,7 +142,7 @@
           <w:i w:val="0"/>
           <w:sz w:val="21"/>
         </w:rPr>
-        <w:t>Also note (typed, not screenshotted): the in-game date you captured this on, and the FM save file's own name from the Continue/load-game screen.</w:t>
+        <w:t>Also note: the in-game date you captured this on, and the save's own name (Club &gt; Club Site &gt; FM Menu, top-left, e.g. "Manager Name - Club Name").</w:t>
       </w:r>
     </w:p>
     <w:p>
@@ -152,7 +152,7 @@
           <w:i w:val="0"/>
           <w:sz w:val="21"/>
         </w:rPr>
-        <w:t xml:space="preserve">Easiest way to get these: just ask Claude to capture your club data directly. Have Football Manager open and ask something like "capture my club data for FMCC" — Claude takes control of your screen for that one step, navigates to the right screens itself, and converts them straight into the JSON below without you needing to run anything or take screenshots by hand.</w:t>
+        <w:t xml:space="preserve">Easiest way to get these: just ask Claude to capture your club data directly. Have Football Manager open and ask something like "capture my club data for FMCC" — Claude takes control of your screen for that one step, navigates to the right screens itself (including the FM Menu for the save name), and converts them straight into the JSON below without you needing to run anything or take screenshots by hand.</w:t>
       </w:r>
     </w:p>
     <w:p>

</xml_diff>

<commit_message>
Icon rail + flyout nav, dynamic club-colour contrast fixes, tooltip/divider polish
</commit_message>
<xml_diff>
--- a/docs/FMCC Setup Guide.docx
+++ b/docs/FMCC Setup Guide.docx
@@ -805,7 +805,7 @@
           <w:rFonts w:ascii="Consolas" w:hAnsi="Consolas"/>
           <w:sz w:val="18"/>
         </w:rPr>
-        <w:t xml:space="preserve">      "wage": "£5K p/w", "contract": "30/6/2028",</w:t>
+        <w:t xml:space="preserve">      "wage": "£5K p/w", "transferValue": "£1.2M - £2M", "contract": "30/6/2028",</w:t>
       </w:r>
     </w:p>
     <w:p>
@@ -817,7 +817,7 @@
           <w:rFonts w:ascii="Consolas" w:hAnsi="Consolas"/>
           <w:sz w:val="18"/>
         </w:rPr>
-        <w:t xml:space="preserve">      "status": "injured",       // optional: "injured" | "loan-out" | "loan-in"</w:t>
+        <w:t xml:space="preserve">      "status": "loan-out",       // optional: "loan-out" | "loan-in"</w:t>
       </w:r>
     </w:p>
     <w:p>

</xml_diff>